<commit_message>
Push Fragen mit Klink
</commit_message>
<xml_diff>
--- a/IMS Vorausschauende Budgetplanung_KliLi.docx
+++ b/IMS Vorausschauende Budgetplanung_KliLi.docx
@@ -4,7 +4,7 @@
   <w:body>
     <w:p>
       <w:pPr>
-        <w:pStyle w:val="Heading1"/>
+        <w:pStyle w:val="berschrift1"/>
       </w:pPr>
       <w:r>
         <w:t>Programmierprojekt IMS 2026</w:t>
@@ -145,7 +145,7 @@
     </w:p>
     <w:p>
       <w:pPr>
-        <w:pStyle w:val="ListParagraph"/>
+        <w:pStyle w:val="Listenabsatz"/>
         <w:numPr>
           <w:ilvl w:val="0"/>
           <w:numId w:val="21"/>
@@ -196,7 +196,7 @@
     </w:p>
     <w:p>
       <w:pPr>
-        <w:pStyle w:val="ListParagraph"/>
+        <w:pStyle w:val="Listenabsatz"/>
         <w:numPr>
           <w:ilvl w:val="0"/>
           <w:numId w:val="21"/>
@@ -238,7 +238,7 @@
     </w:p>
     <w:p>
       <w:pPr>
-        <w:pStyle w:val="ListParagraph"/>
+        <w:pStyle w:val="Listenabsatz"/>
         <w:numPr>
           <w:ilvl w:val="0"/>
           <w:numId w:val="21"/>
@@ -277,7 +277,7 @@
     </w:p>
     <w:p>
       <w:pPr>
-        <w:pStyle w:val="ListParagraph"/>
+        <w:pStyle w:val="Listenabsatz"/>
         <w:numPr>
           <w:ilvl w:val="0"/>
           <w:numId w:val="21"/>
@@ -295,7 +295,7 @@
     </w:p>
     <w:p>
       <w:pPr>
-        <w:pStyle w:val="ListParagraph"/>
+        <w:pStyle w:val="Listenabsatz"/>
         <w:numPr>
           <w:ilvl w:val="0"/>
           <w:numId w:val="22"/>
@@ -307,7 +307,7 @@
     </w:p>
     <w:p>
       <w:pPr>
-        <w:pStyle w:val="ListParagraph"/>
+        <w:pStyle w:val="Listenabsatz"/>
         <w:numPr>
           <w:ilvl w:val="0"/>
           <w:numId w:val="22"/>
@@ -334,7 +334,7 @@
     </w:p>
     <w:p>
       <w:pPr>
-        <w:pStyle w:val="ListParagraph"/>
+        <w:pStyle w:val="Listenabsatz"/>
         <w:numPr>
           <w:ilvl w:val="0"/>
           <w:numId w:val="22"/>
@@ -379,7 +379,7 @@
     </w:p>
     <w:p>
       <w:pPr>
-        <w:pStyle w:val="ListParagraph"/>
+        <w:pStyle w:val="Listenabsatz"/>
         <w:numPr>
           <w:ilvl w:val="0"/>
           <w:numId w:val="22"/>
@@ -403,7 +403,7 @@
     </w:p>
     <w:p>
       <w:pPr>
-        <w:pStyle w:val="ListParagraph"/>
+        <w:pStyle w:val="Listenabsatz"/>
         <w:numPr>
           <w:ilvl w:val="0"/>
           <w:numId w:val="22"/>
@@ -415,18 +415,24 @@
     </w:p>
     <w:p/>
     <w:p>
-      <w:pPr>
-        <w:pStyle w:val="ListParagraph"/>
-        <w:ind w:left="0"/>
-      </w:pPr>
-      <w:r>
-        <w:t>(ausgeschrieben von: KliLi)</w:t>
+      <w:r>
+        <w:t>Fragen bei Klink:</w:t>
+      </w:r>
+      <w:r>
+        <w:br/>
+      </w:r>
+      <w:proofErr w:type="gramStart"/>
+      <w:r>
+        <w:t>App .msix</w:t>
+      </w:r>
+      <w:proofErr w:type="gramEnd"/>
+      <w:r>
+        <w:t xml:space="preserve"> oder Web-App</w:t>
       </w:r>
     </w:p>
     <w:p>
       <w:r>
-        <w:br/>
-        <w:t>nette mensch</w:t>
+        <w:t xml:space="preserve">Kategorisieren Konsum, Miete… </w:t>
       </w:r>
     </w:p>
     <w:sectPr>
@@ -468,7 +474,7 @@
 <w:ftr xmlns:wpc="http://schemas.microsoft.com/office/word/2010/wordprocessingCanvas" xmlns:cx="http://schemas.microsoft.com/office/drawing/2014/chartex" xmlns:cx1="http://schemas.microsoft.com/office/drawing/2015/9/8/chartex" xmlns:cx2="http://schemas.microsoft.com/office/drawing/2015/10/21/chartex" xmlns:cx3="http://schemas.microsoft.com/office/drawing/2016/5/9/chartex" xmlns:cx4="http://schemas.microsoft.com/office/drawing/2016/5/10/chartex" xmlns:cx5="http://schemas.microsoft.com/office/drawing/2016/5/11/chartex" xmlns:cx6="http://schemas.microsoft.com/office/drawing/2016/5/12/chartex" xmlns:cx7="http://schemas.microsoft.com/office/drawing/2016/5/13/chartex" xmlns:cx8="http://schemas.microsoft.com/office/drawing/2016/5/14/chartex" xmlns:mc="http://schemas.openxmlformats.org/markup-compatibility/2006" xmlns:aink="http://schemas.microsoft.com/office/drawing/2016/ink" xmlns:am3d="http://schemas.microsoft.com/office/drawing/2017/model3d" xmlns:o="urn:schemas-microsoft-com:office:office" xmlns:oel="http://schemas.microsoft.com/office/2019/extlst" xmlns:r="http://schemas.openxmlformats.org/officeDocument/2006/relationships" xmlns:m="http://schemas.openxmlformats.org/officeDocument/2006/math" xmlns:v="urn:schemas-microsoft-com:vml" xmlns:wp14="http://schemas.microsoft.com/office/word/2010/wordprocessingDrawing" xmlns:wp="http://schemas.openxmlformats.org/drawingml/2006/wordprocessingDrawing" xmlns:w10="urn:schemas-microsoft-com:office:word" xmlns:w="http://schemas.openxmlformats.org/wordprocessingml/2006/main" xmlns:w14="http://schemas.microsoft.com/office/word/2010/wordml" xmlns:w15="http://schemas.microsoft.com/office/word/2012/wordml" xmlns:w16cex="http://schemas.microsoft.com/office/word/2018/wordml/cex" xmlns:w16cid="http://schemas.microsoft.com/office/word/2016/wordml/cid" xmlns:w16="http://schemas.microsoft.com/office/word/2018/wordml" xmlns:w16du="http://schemas.microsoft.com/office/word/2023/wordml/word16du" xmlns:w16sdtdh="http://schemas.microsoft.com/office/word/2020/wordml/sdtdatahash" xmlns:w16sdtfl="http://schemas.microsoft.com/office/word/2024/wordml/sdtformatlock" xmlns:w16se="http://schemas.microsoft.com/office/word/2015/wordml/symex" xmlns:wpg="http://schemas.microsoft.com/office/word/2010/wordprocessingGroup" xmlns:wpi="http://schemas.microsoft.com/office/word/2010/wordprocessingInk" xmlns:wne="http://schemas.microsoft.com/office/word/2006/wordml" xmlns:wps="http://schemas.microsoft.com/office/word/2010/wordprocessingShape" mc:Ignorable="w14 w15 w16se w16cid w16 w16cex w16sdtdh w16sdtfl w16du wp14">
   <w:p>
     <w:pPr>
-      <w:pStyle w:val="Footer"/>
+      <w:pStyle w:val="Fuzeile"/>
     </w:pPr>
     <w:r>
       <w:fldChar w:fldCharType="begin"/>
@@ -541,7 +547,7 @@
 <w:ftr xmlns:wpc="http://schemas.microsoft.com/office/word/2010/wordprocessingCanvas" xmlns:cx="http://schemas.microsoft.com/office/drawing/2014/chartex" xmlns:cx1="http://schemas.microsoft.com/office/drawing/2015/9/8/chartex" xmlns:cx2="http://schemas.microsoft.com/office/drawing/2015/10/21/chartex" xmlns:cx3="http://schemas.microsoft.com/office/drawing/2016/5/9/chartex" xmlns:cx4="http://schemas.microsoft.com/office/drawing/2016/5/10/chartex" xmlns:cx5="http://schemas.microsoft.com/office/drawing/2016/5/11/chartex" xmlns:cx6="http://schemas.microsoft.com/office/drawing/2016/5/12/chartex" xmlns:cx7="http://schemas.microsoft.com/office/drawing/2016/5/13/chartex" xmlns:cx8="http://schemas.microsoft.com/office/drawing/2016/5/14/chartex" xmlns:mc="http://schemas.openxmlformats.org/markup-compatibility/2006" xmlns:aink="http://schemas.microsoft.com/office/drawing/2016/ink" xmlns:am3d="http://schemas.microsoft.com/office/drawing/2017/model3d" xmlns:o="urn:schemas-microsoft-com:office:office" xmlns:oel="http://schemas.microsoft.com/office/2019/extlst" xmlns:r="http://schemas.openxmlformats.org/officeDocument/2006/relationships" xmlns:m="http://schemas.openxmlformats.org/officeDocument/2006/math" xmlns:v="urn:schemas-microsoft-com:vml" xmlns:wp14="http://schemas.microsoft.com/office/word/2010/wordprocessingDrawing" xmlns:wp="http://schemas.openxmlformats.org/drawingml/2006/wordprocessingDrawing" xmlns:w10="urn:schemas-microsoft-com:office:word" xmlns:w="http://schemas.openxmlformats.org/wordprocessingml/2006/main" xmlns:w14="http://schemas.microsoft.com/office/word/2010/wordml" xmlns:w15="http://schemas.microsoft.com/office/word/2012/wordml" xmlns:w16cex="http://schemas.microsoft.com/office/word/2018/wordml/cex" xmlns:w16cid="http://schemas.microsoft.com/office/word/2016/wordml/cid" xmlns:w16="http://schemas.microsoft.com/office/word/2018/wordml" xmlns:w16du="http://schemas.microsoft.com/office/word/2023/wordml/word16du" xmlns:w16sdtdh="http://schemas.microsoft.com/office/word/2020/wordml/sdtdatahash" xmlns:w16sdtfl="http://schemas.microsoft.com/office/word/2024/wordml/sdtformatlock" xmlns:w16se="http://schemas.microsoft.com/office/word/2015/wordml/symex" xmlns:wpg="http://schemas.microsoft.com/office/word/2010/wordprocessingGroup" xmlns:wpi="http://schemas.microsoft.com/office/word/2010/wordprocessingInk" xmlns:wne="http://schemas.microsoft.com/office/word/2006/wordml" xmlns:wps="http://schemas.microsoft.com/office/word/2010/wordprocessingShape" mc:Ignorable="w14 w15 w16se w16cid w16 w16cex w16sdtdh w16sdtfl w16du wp14">
   <w:p>
     <w:pPr>
-      <w:pStyle w:val="Footer"/>
+      <w:pStyle w:val="Fuzeile"/>
     </w:pPr>
     <w:r>
       <w:t xml:space="preserve"> </w:t>
@@ -575,7 +581,7 @@
 <w:hdr xmlns:wpc="http://schemas.microsoft.com/office/word/2010/wordprocessingCanvas" xmlns:cx="http://schemas.microsoft.com/office/drawing/2014/chartex" xmlns:cx1="http://schemas.microsoft.com/office/drawing/2015/9/8/chartex" xmlns:cx2="http://schemas.microsoft.com/office/drawing/2015/10/21/chartex" xmlns:cx3="http://schemas.microsoft.com/office/drawing/2016/5/9/chartex" xmlns:cx4="http://schemas.microsoft.com/office/drawing/2016/5/10/chartex" xmlns:cx5="http://schemas.microsoft.com/office/drawing/2016/5/11/chartex" xmlns:cx6="http://schemas.microsoft.com/office/drawing/2016/5/12/chartex" xmlns:cx7="http://schemas.microsoft.com/office/drawing/2016/5/13/chartex" xmlns:cx8="http://schemas.microsoft.com/office/drawing/2016/5/14/chartex" xmlns:mc="http://schemas.openxmlformats.org/markup-compatibility/2006" xmlns:aink="http://schemas.microsoft.com/office/drawing/2016/ink" xmlns:am3d="http://schemas.microsoft.com/office/drawing/2017/model3d" xmlns:o="urn:schemas-microsoft-com:office:office" xmlns:oel="http://schemas.microsoft.com/office/2019/extlst" xmlns:r="http://schemas.openxmlformats.org/officeDocument/2006/relationships" xmlns:m="http://schemas.openxmlformats.org/officeDocument/2006/math" xmlns:v="urn:schemas-microsoft-com:vml" xmlns:wp14="http://schemas.microsoft.com/office/word/2010/wordprocessingDrawing" xmlns:wp="http://schemas.openxmlformats.org/drawingml/2006/wordprocessingDrawing" xmlns:w10="urn:schemas-microsoft-com:office:word" xmlns:w="http://schemas.openxmlformats.org/wordprocessingml/2006/main" xmlns:w14="http://schemas.microsoft.com/office/word/2010/wordml" xmlns:w15="http://schemas.microsoft.com/office/word/2012/wordml" xmlns:w16cex="http://schemas.microsoft.com/office/word/2018/wordml/cex" xmlns:w16cid="http://schemas.microsoft.com/office/word/2016/wordml/cid" xmlns:w16="http://schemas.microsoft.com/office/word/2018/wordml" xmlns:w16du="http://schemas.microsoft.com/office/word/2023/wordml/word16du" xmlns:w16sdtdh="http://schemas.microsoft.com/office/word/2020/wordml/sdtdatahash" xmlns:w16sdtfl="http://schemas.microsoft.com/office/word/2024/wordml/sdtformatlock" xmlns:w16se="http://schemas.microsoft.com/office/word/2015/wordml/symex" xmlns:wpg="http://schemas.microsoft.com/office/word/2010/wordprocessingGroup" xmlns:wpi="http://schemas.microsoft.com/office/word/2010/wordprocessingInk" xmlns:wne="http://schemas.microsoft.com/office/word/2006/wordml" xmlns:wps="http://schemas.microsoft.com/office/word/2010/wordprocessingShape" mc:Ignorable="w14 w15 w16se w16cid w16 w16cex w16sdtdh w16sdtfl w16du wp14">
   <w:tbl>
     <w:tblPr>
-      <w:tblStyle w:val="TableGrid"/>
+      <w:tblStyle w:val="Tabellenraster"/>
       <w:tblpPr w:vertAnchor="page" w:horzAnchor="page" w:tblpX="8223" w:tblpY="568"/>
       <w:tblW w:w="2835" w:type="dxa"/>
       <w:tblBorders>
@@ -608,7 +614,7 @@
         </w:tcPr>
         <w:p>
           <w:pPr>
-            <w:pStyle w:val="Header"/>
+            <w:pStyle w:val="Kopfzeile"/>
             <w:jc w:val="right"/>
           </w:pPr>
           <w:r>
@@ -677,7 +683,7 @@
   </w:tbl>
   <w:p>
     <w:pPr>
-      <w:pStyle w:val="Header"/>
+      <w:pStyle w:val="Kopfzeile"/>
     </w:pPr>
     <w:r>
       <w:t>Alte Kantonsschule Aarau, Bahnhofstrasse 91, CH-5001 Aarau</w:t>
@@ -685,7 +691,7 @@
   </w:p>
   <w:p>
     <w:pPr>
-      <w:pStyle w:val="Header"/>
+      <w:pStyle w:val="Kopfzeile"/>
     </w:pPr>
     <w:r>
       <w:t>Telefon +41 62 834 67 00, info@altekanti.ch, www.altekanti.ch</w:t>
@@ -1623,6 +1629,119 @@
     </w:lvl>
   </w:abstractNum>
   <w:abstractNum w:abstractNumId="16" w15:restartNumberingAfterBreak="0">
+    <w:nsid w:val="3E9463DA"/>
+    <w:multiLevelType w:val="hybridMultilevel"/>
+    <w:tmpl w:val="B696471E"/>
+    <w:lvl w:ilvl="0" w:tplc="08070001">
+      <w:start w:val="1"/>
+      <w:numFmt w:val="bullet"/>
+      <w:lvlText w:val=""/>
+      <w:lvlJc w:val="left"/>
+      <w:pPr>
+        <w:ind w:left="720" w:hanging="360"/>
+      </w:pPr>
+      <w:rPr>
+        <w:rFonts w:ascii="Symbol" w:hAnsi="Symbol" w:hint="default"/>
+      </w:rPr>
+    </w:lvl>
+    <w:lvl w:ilvl="1" w:tplc="08070003" w:tentative="1">
+      <w:start w:val="1"/>
+      <w:numFmt w:val="bullet"/>
+      <w:lvlText w:val="o"/>
+      <w:lvlJc w:val="left"/>
+      <w:pPr>
+        <w:ind w:left="1440" w:hanging="360"/>
+      </w:pPr>
+      <w:rPr>
+        <w:rFonts w:ascii="Courier New" w:hAnsi="Courier New" w:cs="Courier New" w:hint="default"/>
+      </w:rPr>
+    </w:lvl>
+    <w:lvl w:ilvl="2" w:tplc="08070005" w:tentative="1">
+      <w:start w:val="1"/>
+      <w:numFmt w:val="bullet"/>
+      <w:lvlText w:val=""/>
+      <w:lvlJc w:val="left"/>
+      <w:pPr>
+        <w:ind w:left="2160" w:hanging="360"/>
+      </w:pPr>
+      <w:rPr>
+        <w:rFonts w:ascii="Wingdings" w:hAnsi="Wingdings" w:hint="default"/>
+      </w:rPr>
+    </w:lvl>
+    <w:lvl w:ilvl="3" w:tplc="08070001">
+      <w:start w:val="1"/>
+      <w:numFmt w:val="bullet"/>
+      <w:lvlText w:val=""/>
+      <w:lvlJc w:val="left"/>
+      <w:pPr>
+        <w:ind w:left="2880" w:hanging="360"/>
+      </w:pPr>
+      <w:rPr>
+        <w:rFonts w:ascii="Symbol" w:hAnsi="Symbol" w:hint="default"/>
+      </w:rPr>
+    </w:lvl>
+    <w:lvl w:ilvl="4" w:tplc="08070003" w:tentative="1">
+      <w:start w:val="1"/>
+      <w:numFmt w:val="bullet"/>
+      <w:lvlText w:val="o"/>
+      <w:lvlJc w:val="left"/>
+      <w:pPr>
+        <w:ind w:left="3600" w:hanging="360"/>
+      </w:pPr>
+      <w:rPr>
+        <w:rFonts w:ascii="Courier New" w:hAnsi="Courier New" w:cs="Courier New" w:hint="default"/>
+      </w:rPr>
+    </w:lvl>
+    <w:lvl w:ilvl="5" w:tplc="08070005" w:tentative="1">
+      <w:start w:val="1"/>
+      <w:numFmt w:val="bullet"/>
+      <w:lvlText w:val=""/>
+      <w:lvlJc w:val="left"/>
+      <w:pPr>
+        <w:ind w:left="4320" w:hanging="360"/>
+      </w:pPr>
+      <w:rPr>
+        <w:rFonts w:ascii="Wingdings" w:hAnsi="Wingdings" w:hint="default"/>
+      </w:rPr>
+    </w:lvl>
+    <w:lvl w:ilvl="6" w:tplc="08070001" w:tentative="1">
+      <w:start w:val="1"/>
+      <w:numFmt w:val="bullet"/>
+      <w:lvlText w:val=""/>
+      <w:lvlJc w:val="left"/>
+      <w:pPr>
+        <w:ind w:left="5040" w:hanging="360"/>
+      </w:pPr>
+      <w:rPr>
+        <w:rFonts w:ascii="Symbol" w:hAnsi="Symbol" w:hint="default"/>
+      </w:rPr>
+    </w:lvl>
+    <w:lvl w:ilvl="7" w:tplc="08070003" w:tentative="1">
+      <w:start w:val="1"/>
+      <w:numFmt w:val="bullet"/>
+      <w:lvlText w:val="o"/>
+      <w:lvlJc w:val="left"/>
+      <w:pPr>
+        <w:ind w:left="5760" w:hanging="360"/>
+      </w:pPr>
+      <w:rPr>
+        <w:rFonts w:ascii="Courier New" w:hAnsi="Courier New" w:cs="Courier New" w:hint="default"/>
+      </w:rPr>
+    </w:lvl>
+    <w:lvl w:ilvl="8" w:tplc="08070005" w:tentative="1">
+      <w:start w:val="1"/>
+      <w:numFmt w:val="bullet"/>
+      <w:lvlText w:val=""/>
+      <w:lvlJc w:val="left"/>
+      <w:pPr>
+        <w:ind w:left="6480" w:hanging="360"/>
+      </w:pPr>
+      <w:rPr>
+        <w:rFonts w:ascii="Wingdings" w:hAnsi="Wingdings" w:hint="default"/>
+      </w:rPr>
+    </w:lvl>
+  </w:abstractNum>
+  <w:abstractNum w:abstractNumId="17" w15:restartNumberingAfterBreak="0">
     <w:nsid w:val="44357985"/>
     <w:multiLevelType w:val="hybridMultilevel"/>
     <w:tmpl w:val="6450E0EE"/>
@@ -1779,7 +1898,7 @@
       </w:rPr>
     </w:lvl>
   </w:abstractNum>
-  <w:abstractNum w:abstractNumId="17" w15:restartNumberingAfterBreak="0">
+  <w:abstractNum w:abstractNumId="18" w15:restartNumberingAfterBreak="0">
     <w:nsid w:val="5F517D17"/>
     <w:multiLevelType w:val="hybridMultilevel"/>
     <w:tmpl w:val="77CAE25C"/>
@@ -1892,7 +2011,7 @@
       </w:rPr>
     </w:lvl>
   </w:abstractNum>
-  <w:abstractNum w:abstractNumId="18" w15:restartNumberingAfterBreak="0">
+  <w:abstractNum w:abstractNumId="19" w15:restartNumberingAfterBreak="0">
     <w:nsid w:val="65426686"/>
     <w:multiLevelType w:val="hybridMultilevel"/>
     <w:tmpl w:val="ED2E85D2"/>
@@ -1978,7 +2097,7 @@
       </w:pPr>
     </w:lvl>
   </w:abstractNum>
-  <w:abstractNum w:abstractNumId="19" w15:restartNumberingAfterBreak="0">
+  <w:abstractNum w:abstractNumId="20" w15:restartNumberingAfterBreak="0">
     <w:nsid w:val="6D581C80"/>
     <w:multiLevelType w:val="multilevel"/>
     <w:tmpl w:val="0407001D"/>
@@ -2064,7 +2183,7 @@
       </w:pPr>
     </w:lvl>
   </w:abstractNum>
-  <w:abstractNum w:abstractNumId="20" w15:restartNumberingAfterBreak="0">
+  <w:abstractNum w:abstractNumId="21" w15:restartNumberingAfterBreak="0">
     <w:nsid w:val="774D151F"/>
     <w:multiLevelType w:val="hybridMultilevel"/>
     <w:tmpl w:val="47F4E65C"/>
@@ -2206,10 +2325,10 @@
     </w:lvl>
   </w:abstractNum>
   <w:num w:numId="1" w16cid:durableId="434404166">
-    <w:abstractNumId w:val="20"/>
+    <w:abstractNumId w:val="21"/>
   </w:num>
   <w:num w:numId="2" w16cid:durableId="443499536">
-    <w:abstractNumId w:val="16"/>
+    <w:abstractNumId w:val="17"/>
   </w:num>
   <w:num w:numId="3" w16cid:durableId="2037191526">
     <w:abstractNumId w:val="11"/>
@@ -2224,7 +2343,7 @@
     <w:abstractNumId w:val="14"/>
   </w:num>
   <w:num w:numId="7" w16cid:durableId="1481580504">
-    <w:abstractNumId w:val="19"/>
+    <w:abstractNumId w:val="20"/>
   </w:num>
   <w:num w:numId="8" w16cid:durableId="200477350">
     <w:abstractNumId w:val="0"/>
@@ -2266,13 +2385,16 @@
     <w:abstractNumId w:val="13"/>
   </w:num>
   <w:num w:numId="21" w16cid:durableId="1424299588">
-    <w:abstractNumId w:val="17"/>
+    <w:abstractNumId w:val="18"/>
   </w:num>
   <w:num w:numId="22" w16cid:durableId="1798376570">
-    <w:abstractNumId w:val="18"/>
+    <w:abstractNumId w:val="19"/>
   </w:num>
   <w:num w:numId="23" w16cid:durableId="1996491697">
     <w:abstractNumId w:val="15"/>
+  </w:num>
+  <w:num w:numId="24" w16cid:durableId="1591154413">
+    <w:abstractNumId w:val="16"/>
   </w:num>
   <w:numIdMacAtCleanup w:val="5"/>
 </w:numbering>
@@ -2665,7 +2787,7 @@
     <w:lsdException w:name="Smart Hyperlink" w:semiHidden="1" w:unhideWhenUsed="1"/>
     <w:lsdException w:name="Smart Link" w:semiHidden="1" w:unhideWhenUsed="1"/>
   </w:latentStyles>
-  <w:style w:type="paragraph" w:default="1" w:styleId="Normal">
+  <w:style w:type="paragraph" w:default="1" w:styleId="Standard">
     <w:name w:val="Normal"/>
     <w:qFormat/>
     <w:rsid w:val="008A1C85"/>
@@ -2682,11 +2804,11 @@
       <w:lang w:val="de-CH"/>
     </w:rPr>
   </w:style>
-  <w:style w:type="paragraph" w:styleId="Heading1">
+  <w:style w:type="paragraph" w:styleId="berschrift1">
     <w:name w:val="heading 1"/>
-    <w:basedOn w:val="Normal"/>
-    <w:next w:val="Normal"/>
-    <w:link w:val="Heading1Char"/>
+    <w:basedOn w:val="Standard"/>
+    <w:next w:val="Standard"/>
+    <w:link w:val="berschrift1Zchn"/>
     <w:uiPriority w:val="1"/>
     <w:rsid w:val="0044121E"/>
     <w:pPr>
@@ -2701,10 +2823,10 @@
       <w:szCs w:val="28"/>
     </w:rPr>
   </w:style>
-  <w:style w:type="paragraph" w:styleId="Heading2">
+  <w:style w:type="paragraph" w:styleId="berschrift2">
     <w:name w:val="heading 2"/>
-    <w:basedOn w:val="Heading1"/>
-    <w:next w:val="Normal"/>
+    <w:basedOn w:val="berschrift1"/>
+    <w:next w:val="Standard"/>
     <w:semiHidden/>
     <w:qFormat/>
     <w:rsid w:val="00DD19FA"/>
@@ -2721,10 +2843,10 @@
       <w:szCs w:val="26"/>
     </w:rPr>
   </w:style>
-  <w:style w:type="paragraph" w:styleId="Heading3">
+  <w:style w:type="paragraph" w:styleId="berschrift3">
     <w:name w:val="heading 3"/>
-    <w:basedOn w:val="Heading2"/>
-    <w:next w:val="Normal"/>
+    <w:basedOn w:val="berschrift2"/>
+    <w:next w:val="Standard"/>
     <w:semiHidden/>
     <w:qFormat/>
     <w:rsid w:val="00DD19FA"/>
@@ -2736,10 +2858,10 @@
       <w:szCs w:val="24"/>
     </w:rPr>
   </w:style>
-  <w:style w:type="paragraph" w:styleId="Heading4">
+  <w:style w:type="paragraph" w:styleId="berschrift4">
     <w:name w:val="heading 4"/>
-    <w:basedOn w:val="Normal"/>
-    <w:next w:val="Normal"/>
+    <w:basedOn w:val="Standard"/>
+    <w:next w:val="Standard"/>
     <w:semiHidden/>
     <w:qFormat/>
     <w:rsid w:val="006B1BED"/>
@@ -2758,10 +2880,10 @@
       <w:color w:val="4F81BD" w:themeColor="accent1"/>
     </w:rPr>
   </w:style>
-  <w:style w:type="paragraph" w:styleId="Heading5">
+  <w:style w:type="paragraph" w:styleId="berschrift5">
     <w:name w:val="heading 5"/>
-    <w:basedOn w:val="Heading4"/>
-    <w:next w:val="Normal"/>
+    <w:basedOn w:val="berschrift4"/>
+    <w:next w:val="Standard"/>
     <w:semiHidden/>
     <w:qFormat/>
     <w:rsid w:val="00DD19FA"/>
@@ -2776,9 +2898,9 @@
       <w:color w:val="243F60" w:themeColor="accent1" w:themeShade="7F"/>
     </w:rPr>
   </w:style>
-  <w:style w:type="paragraph" w:styleId="Heading6">
+  <w:style w:type="paragraph" w:styleId="berschrift6">
     <w:name w:val="heading 6"/>
-    <w:basedOn w:val="Normal"/>
+    <w:basedOn w:val="Standard"/>
     <w:semiHidden/>
     <w:qFormat/>
     <w:rsid w:val="00DD19FA"/>
@@ -2795,10 +2917,10 @@
       <w:color w:val="243F60" w:themeColor="accent1" w:themeShade="7F"/>
     </w:rPr>
   </w:style>
-  <w:style w:type="paragraph" w:styleId="Heading7">
+  <w:style w:type="paragraph" w:styleId="berschrift7">
     <w:name w:val="heading 7"/>
-    <w:basedOn w:val="Normal"/>
-    <w:next w:val="Normal"/>
+    <w:basedOn w:val="Standard"/>
+    <w:next w:val="Standard"/>
     <w:semiHidden/>
     <w:qFormat/>
     <w:rsid w:val="00DD19FA"/>
@@ -2815,10 +2937,10 @@
       <w:color w:val="404040" w:themeColor="text1" w:themeTint="BF"/>
     </w:rPr>
   </w:style>
-  <w:style w:type="paragraph" w:styleId="Heading8">
+  <w:style w:type="paragraph" w:styleId="berschrift8">
     <w:name w:val="heading 8"/>
-    <w:basedOn w:val="Normal"/>
-    <w:next w:val="Normal"/>
+    <w:basedOn w:val="Standard"/>
+    <w:next w:val="Standard"/>
     <w:semiHidden/>
     <w:qFormat/>
     <w:rsid w:val="00DD19FA"/>
@@ -2834,10 +2956,10 @@
       <w:szCs w:val="20"/>
     </w:rPr>
   </w:style>
-  <w:style w:type="paragraph" w:styleId="Heading9">
+  <w:style w:type="paragraph" w:styleId="berschrift9">
     <w:name w:val="heading 9"/>
-    <w:basedOn w:val="Normal"/>
-    <w:next w:val="Normal"/>
+    <w:basedOn w:val="Standard"/>
+    <w:next w:val="Standard"/>
     <w:semiHidden/>
     <w:qFormat/>
     <w:rsid w:val="00DD19FA"/>
@@ -2855,13 +2977,12 @@
       <w:szCs w:val="20"/>
     </w:rPr>
   </w:style>
-  <w:style w:type="character" w:default="1" w:styleId="DefaultParagraphFont">
+  <w:style w:type="character" w:default="1" w:styleId="Absatz-Standardschriftart">
     <w:name w:val="Default Paragraph Font"/>
     <w:uiPriority w:val="1"/>
-    <w:semiHidden/>
     <w:unhideWhenUsed/>
   </w:style>
-  <w:style w:type="table" w:default="1" w:styleId="TableNormal">
+  <w:style w:type="table" w:default="1" w:styleId="NormaleTabelle">
     <w:name w:val="Normal Table"/>
     <w:uiPriority w:val="99"/>
     <w:semiHidden/>
@@ -2876,15 +2997,15 @@
       </w:tblCellMar>
     </w:tblPr>
   </w:style>
-  <w:style w:type="numbering" w:default="1" w:styleId="NoList">
+  <w:style w:type="numbering" w:default="1" w:styleId="KeineListe">
     <w:name w:val="No List"/>
     <w:uiPriority w:val="99"/>
     <w:semiHidden/>
     <w:unhideWhenUsed/>
   </w:style>
-  <w:style w:type="paragraph" w:styleId="Header">
+  <w:style w:type="paragraph" w:styleId="Kopfzeile">
     <w:name w:val="header"/>
-    <w:link w:val="HeaderChar"/>
+    <w:link w:val="KopfzeileZchn"/>
     <w:uiPriority w:val="9"/>
     <w:qFormat/>
     <w:rsid w:val="00C11D45"/>
@@ -2904,10 +3025,10 @@
       <w:lang w:val="de-CH"/>
     </w:rPr>
   </w:style>
-  <w:style w:type="character" w:customStyle="1" w:styleId="HeaderChar">
-    <w:name w:val="Header Char"/>
-    <w:basedOn w:val="DefaultParagraphFont"/>
-    <w:link w:val="Header"/>
+  <w:style w:type="character" w:customStyle="1" w:styleId="KopfzeileZchn">
+    <w:name w:val="Kopfzeile Zchn"/>
+    <w:basedOn w:val="Absatz-Standardschriftart"/>
+    <w:link w:val="Kopfzeile"/>
     <w:uiPriority w:val="9"/>
     <w:rsid w:val="00C11D45"/>
     <w:rPr>
@@ -2920,10 +3041,10 @@
       <w:lang w:val="de-CH"/>
     </w:rPr>
   </w:style>
-  <w:style w:type="paragraph" w:styleId="Footer">
+  <w:style w:type="paragraph" w:styleId="Fuzeile">
     <w:name w:val="footer"/>
-    <w:basedOn w:val="Normal"/>
-    <w:link w:val="FooterChar"/>
+    <w:basedOn w:val="Standard"/>
+    <w:link w:val="FuzeileZchn"/>
     <w:uiPriority w:val="10"/>
     <w:qFormat/>
     <w:rsid w:val="007252B8"/>
@@ -2940,10 +3061,10 @@
       <w:sz w:val="16"/>
     </w:rPr>
   </w:style>
-  <w:style w:type="character" w:customStyle="1" w:styleId="FooterChar">
-    <w:name w:val="Footer Char"/>
-    <w:basedOn w:val="DefaultParagraphFont"/>
-    <w:link w:val="Footer"/>
+  <w:style w:type="character" w:customStyle="1" w:styleId="FuzeileZchn">
+    <w:name w:val="Fußzeile Zchn"/>
+    <w:basedOn w:val="Absatz-Standardschriftart"/>
+    <w:link w:val="Fuzeile"/>
     <w:uiPriority w:val="10"/>
     <w:rsid w:val="000F3F94"/>
     <w:rPr>
@@ -2955,7 +3076,7 @@
   </w:style>
   <w:style w:type="paragraph" w:customStyle="1" w:styleId="StandardAufzhlung">
     <w:name w:val="Standard Aufzählung"/>
-    <w:basedOn w:val="Normal"/>
+    <w:basedOn w:val="Standard"/>
     <w:rsid w:val="005B1A91"/>
     <w:pPr>
       <w:numPr>
@@ -2970,10 +3091,10 @@
       <w:ind w:left="142" w:hanging="142"/>
     </w:pPr>
   </w:style>
-  <w:style w:type="paragraph" w:styleId="BalloonText">
+  <w:style w:type="paragraph" w:styleId="Sprechblasentext">
     <w:name w:val="Balloon Text"/>
-    <w:basedOn w:val="Normal"/>
-    <w:link w:val="BalloonTextChar"/>
+    <w:basedOn w:val="Standard"/>
+    <w:link w:val="SprechblasentextZchn"/>
     <w:uiPriority w:val="99"/>
     <w:semiHidden/>
     <w:unhideWhenUsed/>
@@ -2989,7 +3110,7 @@
   </w:style>
   <w:style w:type="paragraph" w:customStyle="1" w:styleId="Absender">
     <w:name w:val="Absender"/>
-    <w:basedOn w:val="Normal"/>
+    <w:basedOn w:val="Standard"/>
     <w:uiPriority w:val="7"/>
     <w:qFormat/>
     <w:rsid w:val="00B05309"/>
@@ -3001,10 +3122,10 @@
       </w:tabs>
     </w:pPr>
   </w:style>
-  <w:style w:type="character" w:customStyle="1" w:styleId="Heading1Char">
-    <w:name w:val="Heading 1 Char"/>
-    <w:basedOn w:val="DefaultParagraphFont"/>
-    <w:link w:val="Heading1"/>
+  <w:style w:type="character" w:customStyle="1" w:styleId="berschrift1Zchn">
+    <w:name w:val="Überschrift 1 Zchn"/>
+    <w:basedOn w:val="Absatz-Standardschriftart"/>
+    <w:link w:val="berschrift1"/>
     <w:uiPriority w:val="1"/>
     <w:rsid w:val="000F3F94"/>
     <w:rPr>
@@ -3016,7 +3137,7 @@
       <w:lang w:val="de-CH"/>
     </w:rPr>
   </w:style>
-  <w:style w:type="paragraph" w:styleId="Revision">
+  <w:style w:type="paragraph" w:styleId="berarbeitung">
     <w:name w:val="Revision"/>
     <w:hidden/>
     <w:uiPriority w:val="99"/>
@@ -3030,7 +3151,7 @@
   </w:style>
   <w:style w:type="character" w:styleId="Hyperlink">
     <w:name w:val="Hyperlink"/>
-    <w:basedOn w:val="DefaultParagraphFont"/>
+    <w:basedOn w:val="Absatz-Standardschriftart"/>
     <w:uiPriority w:val="2"/>
     <w:qFormat/>
     <w:rsid w:val="00DB3437"/>
@@ -3039,10 +3160,10 @@
       <w:u w:val="none"/>
     </w:rPr>
   </w:style>
-  <w:style w:type="character" w:customStyle="1" w:styleId="BalloonTextChar">
-    <w:name w:val="Balloon Text Char"/>
-    <w:basedOn w:val="DefaultParagraphFont"/>
-    <w:link w:val="BalloonText"/>
+  <w:style w:type="character" w:customStyle="1" w:styleId="SprechblasentextZchn">
+    <w:name w:val="Sprechblasentext Zchn"/>
+    <w:basedOn w:val="Absatz-Standardschriftart"/>
+    <w:link w:val="Sprechblasentext"/>
     <w:uiPriority w:val="99"/>
     <w:semiHidden/>
     <w:rsid w:val="000F1E21"/>
@@ -3054,7 +3175,7 @@
   </w:style>
   <w:style w:type="paragraph" w:customStyle="1" w:styleId="Gruss">
     <w:name w:val="Gruss"/>
-    <w:basedOn w:val="Normal"/>
+    <w:basedOn w:val="Standard"/>
     <w:next w:val="Absender"/>
     <w:uiPriority w:val="6"/>
     <w:qFormat/>
@@ -3069,7 +3190,7 @@
   </w:style>
   <w:style w:type="paragraph" w:customStyle="1" w:styleId="Beilagen">
     <w:name w:val="Beilagen"/>
-    <w:basedOn w:val="Normal"/>
+    <w:basedOn w:val="Standard"/>
     <w:next w:val="StandardAufzhlung"/>
     <w:uiPriority w:val="8"/>
     <w:qFormat/>
@@ -3081,9 +3202,9 @@
       <w:spacing w:before="280"/>
     </w:pPr>
   </w:style>
-  <w:style w:type="character" w:styleId="Strong">
+  <w:style w:type="character" w:styleId="Fett">
     <w:name w:val="Strong"/>
-    <w:basedOn w:val="DefaultParagraphFont"/>
+    <w:basedOn w:val="Absatz-Standardschriftart"/>
     <w:uiPriority w:val="2"/>
     <w:rsid w:val="00514949"/>
     <w:rPr>
@@ -3093,9 +3214,9 @@
       <w:i w:val="0"/>
     </w:rPr>
   </w:style>
-  <w:style w:type="table" w:styleId="TableGrid">
+  <w:style w:type="table" w:styleId="Tabellenraster">
     <w:name w:val="Table Grid"/>
-    <w:basedOn w:val="TableNormal"/>
+    <w:basedOn w:val="NormaleTabelle"/>
     <w:uiPriority w:val="59"/>
     <w:rsid w:val="00C8583C"/>
     <w:tblPr>
@@ -3109,11 +3230,11 @@
       </w:tblBorders>
     </w:tblPr>
   </w:style>
-  <w:style w:type="paragraph" w:styleId="Date">
+  <w:style w:type="paragraph" w:styleId="Datum">
     <w:name w:val="Date"/>
-    <w:basedOn w:val="Normal"/>
-    <w:next w:val="Heading1"/>
-    <w:link w:val="DateChar"/>
+    <w:basedOn w:val="Standard"/>
+    <w:next w:val="berschrift1"/>
+    <w:link w:val="DatumZchn"/>
     <w:uiPriority w:val="4"/>
     <w:qFormat/>
     <w:rsid w:val="0044121E"/>
@@ -3121,10 +3242,10 @@
       <w:spacing w:before="1120" w:after="560"/>
     </w:pPr>
   </w:style>
-  <w:style w:type="character" w:customStyle="1" w:styleId="DateChar">
-    <w:name w:val="Date Char"/>
-    <w:basedOn w:val="DefaultParagraphFont"/>
-    <w:link w:val="Date"/>
+  <w:style w:type="character" w:customStyle="1" w:styleId="DatumZchn">
+    <w:name w:val="Datum Zchn"/>
+    <w:basedOn w:val="Absatz-Standardschriftart"/>
+    <w:link w:val="Datum"/>
     <w:uiPriority w:val="4"/>
     <w:rsid w:val="000F3F94"/>
     <w:rPr>
@@ -3135,8 +3256,8 @@
   </w:style>
   <w:style w:type="paragraph" w:customStyle="1" w:styleId="DatumwennAdresse5-zeilig">
     <w:name w:val="Datum (wenn Adresse 5-zeilig)"/>
-    <w:basedOn w:val="Date"/>
-    <w:next w:val="Heading1"/>
+    <w:basedOn w:val="Datum"/>
+    <w:next w:val="berschrift1"/>
     <w:uiPriority w:val="5"/>
     <w:qFormat/>
     <w:rsid w:val="00296452"/>
@@ -3144,9 +3265,9 @@
       <w:spacing w:before="840"/>
     </w:pPr>
   </w:style>
-  <w:style w:type="paragraph" w:styleId="ListParagraph">
+  <w:style w:type="paragraph" w:styleId="Listenabsatz">
     <w:name w:val="List Paragraph"/>
-    <w:basedOn w:val="Normal"/>
+    <w:basedOn w:val="Standard"/>
     <w:uiPriority w:val="2"/>
     <w:rsid w:val="00C12A32"/>
     <w:pPr>
@@ -3452,6 +3573,10 @@
 </file>
 
 <file path=customXml/item2.xml><?xml version="1.0" encoding="utf-8"?>
+<b:Sources xmlns:b="http://schemas.openxmlformats.org/officeDocument/2006/bibliography" xmlns="http://schemas.openxmlformats.org/officeDocument/2006/bibliography" SelectedStyle="\SIST02.XSL" StyleName="SIST02"/>
+</file>
+
+<file path=customXml/item3.xml><?xml version="1.0" encoding="utf-8"?>
 <ct:contentTypeSchema xmlns:ct="http://schemas.microsoft.com/office/2006/metadata/contentType" xmlns:ma="http://schemas.microsoft.com/office/2006/metadata/properties/metaAttributes" ct:_="" ma:_="" ma:contentTypeName="Dokument" ma:contentTypeID="0x010100AE0C5756AC2D414D8F8564B64262A9EC" ma:contentTypeVersion="9" ma:contentTypeDescription="Ein neues Dokument erstellen." ma:contentTypeScope="" ma:versionID="4688148a5a910c11399e3620e3de19d9">
   <xsd:schema xmlns:xsd="http://www.w3.org/2001/XMLSchema" xmlns:xs="http://www.w3.org/2001/XMLSchema" xmlns:p="http://schemas.microsoft.com/office/2006/metadata/properties" xmlns:ns2="e5ceb0c9-c790-4b42-91f5-36f3289928b8" xmlns:ns3="bddcebe1-282f-4983-9785-9cf1c60e5865" targetNamespace="http://schemas.microsoft.com/office/2006/metadata/properties" ma:root="true" ma:fieldsID="5fdc3d0bb301c0d610f4c66d5b1ada93" ns2:_="" ns3:_="">
     <xsd:import namespace="e5ceb0c9-c790-4b42-91f5-36f3289928b8"/>
@@ -3632,11 +3757,16 @@
 </ct:contentTypeSchema>
 </file>
 
-<file path=customXml/item3.xml><?xml version="1.0" encoding="utf-8"?>
-<b:Sources xmlns:b="http://schemas.openxmlformats.org/officeDocument/2006/bibliography" xmlns="http://schemas.openxmlformats.org/officeDocument/2006/bibliography" SelectedStyle="\SIST02.XSL" StyleName="SIST02"/>
+<file path=customXml/item4.xml><?xml version="1.0" encoding="utf-8"?>
+<?mso-contentType ?>
+<FormTemplates xmlns="http://schemas.microsoft.com/sharepoint/v3/contenttype/forms">
+  <Display>DocumentLibraryForm</Display>
+  <Edit>DocumentLibraryForm</Edit>
+  <New>DocumentLibraryForm</New>
+</FormTemplates>
 </file>
 
-<file path=customXml/item4.xml><?xml version="1.0" encoding="utf-8"?>
+<file path=customXml/item5.xml><?xml version="1.0" encoding="utf-8"?>
 <p:properties xmlns:p="http://schemas.microsoft.com/office/2006/metadata/properties" xmlns:xsi="http://www.w3.org/2001/XMLSchema-instance" xmlns:pc="http://schemas.microsoft.com/office/infopath/2007/PartnerControls">
   <documentManagement>
     <lcf76f155ced4ddcb4097134ff3c332f xmlns="e5ceb0c9-c790-4b42-91f5-36f3289928b8">
@@ -3645,15 +3775,6 @@
     <TaxCatchAll xmlns="bddcebe1-282f-4983-9785-9cf1c60e5865" xsi:nil="true"/>
   </documentManagement>
 </p:properties>
-</file>
-
-<file path=customXml/item5.xml><?xml version="1.0" encoding="utf-8"?>
-<?mso-contentType ?>
-<FormTemplates xmlns="http://schemas.microsoft.com/sharepoint/v3/contenttype/forms">
-  <Display>DocumentLibraryForm</Display>
-  <Edit>DocumentLibraryForm</Edit>
-  <New>DocumentLibraryForm</New>
-</FormTemplates>
 </file>
 
 <file path=customXml/itemProps1.xml><?xml version="1.0" encoding="utf-8"?>
@@ -3665,6 +3786,14 @@
 </file>
 
 <file path=customXml/itemProps2.xml><?xml version="1.0" encoding="utf-8"?>
+<ds:datastoreItem xmlns:ds="http://schemas.openxmlformats.org/officeDocument/2006/customXml" ds:itemID="{3059D456-312B-A94E-B5DC-A1D2D729AC16}">
+  <ds:schemaRefs>
+    <ds:schemaRef ds:uri="http://schemas.openxmlformats.org/officeDocument/2006/bibliography"/>
+  </ds:schemaRefs>
+</ds:datastoreItem>
+</file>
+
+<file path=customXml/itemProps3.xml><?xml version="1.0" encoding="utf-8"?>
 <ds:datastoreItem xmlns:ds="http://schemas.openxmlformats.org/officeDocument/2006/customXml" ds:itemID="{CBB941E1-2090-4AB4-955C-62A1618C09FB}">
   <ds:schemaRefs>
     <ds:schemaRef ds:uri="http://schemas.microsoft.com/office/2006/metadata/contentType"/>
@@ -3683,15 +3812,15 @@
 </ds:datastoreItem>
 </file>
 
-<file path=customXml/itemProps3.xml><?xml version="1.0" encoding="utf-8"?>
-<ds:datastoreItem xmlns:ds="http://schemas.openxmlformats.org/officeDocument/2006/customXml" ds:itemID="{3059D456-312B-A94E-B5DC-A1D2D729AC16}">
+<file path=customXml/itemProps4.xml><?xml version="1.0" encoding="utf-8"?>
+<ds:datastoreItem xmlns:ds="http://schemas.openxmlformats.org/officeDocument/2006/customXml" ds:itemID="{0042545B-4137-4CF4-BCF5-A6D5E3EA2B80}">
   <ds:schemaRefs>
-    <ds:schemaRef ds:uri="http://schemas.openxmlformats.org/officeDocument/2006/bibliography"/>
+    <ds:schemaRef ds:uri="http://schemas.microsoft.com/sharepoint/v3/contenttype/forms"/>
   </ds:schemaRefs>
 </ds:datastoreItem>
 </file>
 
-<file path=customXml/itemProps4.xml><?xml version="1.0" encoding="utf-8"?>
+<file path=customXml/itemProps5.xml><?xml version="1.0" encoding="utf-8"?>
 <ds:datastoreItem xmlns:ds="http://schemas.openxmlformats.org/officeDocument/2006/customXml" ds:itemID="{EEB59AE7-6B91-42B3-990C-99E6E9AF261D}">
   <ds:schemaRefs>
     <ds:schemaRef ds:uri="http://schemas.microsoft.com/office/2006/metadata/properties"/>
@@ -3700,12 +3829,4 @@
     <ds:schemaRef ds:uri="bddcebe1-282f-4983-9785-9cf1c60e5865"/>
   </ds:schemaRefs>
 </ds:datastoreItem>
-</file>
-
-<file path=customXml/itemProps5.xml><?xml version="1.0" encoding="utf-8"?>
-<ds:datastoreItem xmlns:ds="http://schemas.openxmlformats.org/officeDocument/2006/customXml" ds:itemID="{0042545B-4137-4CF4-BCF5-A6D5E3EA2B80}">
-  <ds:schemaRefs>
-    <ds:schemaRef ds:uri="http://schemas.microsoft.com/sharepoint/v3/contenttype/forms"/>
-  </ds:schemaRefs>
-</ds:datastoreItem>
 </file>
</xml_diff>